<commit_message>
Update GDD et CDC
Mise en page complète du GDD (en intégrant les parties rédigées par Anthony et Jordan, ainsi que les illustrations d'Elise).
Modifications mineures de mise en page sur le CDC.
</commit_message>
<xml_diff>
--- a/Cahier des charges.docx
+++ b/Cahier des charges.docx
@@ -29,6 +29,27 @@
       <w:r>
         <w:t>Civilisationnelle</w:t>
       </w:r>
+    </w:p>
+    <w:p>
+      <w:r>
+        <w:t xml:space="preserve">Lien vers le </w:t>
+      </w:r>
+      <w:proofErr w:type="spellStart"/>
+      <w:r>
+        <w:t>Github</w:t>
+      </w:r>
+      <w:proofErr w:type="spellEnd"/>
+      <w:r>
+        <w:t xml:space="preserve"> de travail : </w:t>
+      </w:r>
+      <w:hyperlink r:id="rId8" w:history="1">
+        <w:r>
+          <w:rPr>
+            <w:rStyle w:val="Lienhypertexte"/>
+          </w:rPr>
+          <w:t>https://github.com/JeuEnigmeTempsReel-GDDAvance/GCD</w:t>
+        </w:r>
+      </w:hyperlink>
     </w:p>
     <w:p>
       <w:pPr>
@@ -50,10 +71,7 @@
         <w:t xml:space="preserve"> </w:t>
       </w:r>
       <w:r>
-        <w:t>Civilisationnelle</w:t>
-      </w:r>
-      <w:r>
-        <w:t xml:space="preserve"> (OCC), les joueurs coordonnent leurs observations d’une civilisation, émettent puis vérifient des hypothèses, afin de comprendre le fonctionnement d’un ou plusieurs de ses aspects.</w:t>
+        <w:t>Civilisationnelle (OCC), les joueurs coordonnent leurs observations d’une civilisation, émettent puis vérifient des hypothèses, afin de comprendre le fonctionnement d’un ou plusieurs de ses aspects.</w:t>
       </w:r>
     </w:p>
     <w:p>
@@ -78,13 +96,7 @@
     </w:p>
     <w:p>
       <w:r>
-        <w:t xml:space="preserve">Le joueur doit effectuer des actions expérimentales pour avancer dans le jeu. En observant la civilisation qu’il doit comprendre en s’infiltrant à l’intérieur, ses actions servent à valider ou non des hypothèses. Attention cependant, des actions peuvent grandement influencer la civilisation dans une direction. Un exemple pour une civilisation primitive pourrait être : faire apparaître un minerai inconnu à cette civilisation résistant et facile </w:t>
-      </w:r>
-      <w:r>
-        <w:t>à</w:t>
-      </w:r>
-      <w:r>
-        <w:t xml:space="preserve"> manipuler peut entraîner la création d’outils.</w:t>
+        <w:t>Le joueur doit effectuer des actions expérimentales pour avancer dans le jeu. En observant la civilisation qu’il doit comprendre en s’infiltrant à l’intérieur, ses actions servent à valider ou non des hypothèses. Attention cependant, des actions peuvent grandement influencer la civilisation dans une direction. Un exemple pour une civilisation primitive pourrait être : faire apparaître un minerai inconnu à cette civilisation résistant et facile à manipuler peut entraîner la création d’outils.</w:t>
       </w:r>
     </w:p>
     <w:p>
@@ -110,19 +122,7 @@
     </w:p>
     <w:p>
       <w:r>
-        <w:t>Les joueurs doivent remplir des journaux / carnets de notes pour déroul</w:t>
-      </w:r>
-      <w:r>
-        <w:t>er</w:t>
-      </w:r>
-      <w:r>
-        <w:t xml:space="preserve"> petit à petit le contenu qu’ils sont </w:t>
-      </w:r>
-      <w:r>
-        <w:t>censés</w:t>
-      </w:r>
-      <w:r>
-        <w:t xml:space="preserve"> valider pour finir le jeu. Cela peut aussi servir de moyen de communication entre joueurs qui ne sont pas connectés au même moment. Recouper les informations recueillies par différents joueurs entraîne la créations de nouvelles hypothèses qui devront être expérimentées.</w:t>
+        <w:t>Les joueurs doivent remplir des journaux / carnets de notes pour dérouler petit à petit le contenu qu’ils sont censés valider pour finir le jeu. Cela peut aussi servir de moyen de communication entre joueurs qui ne sont pas connectés au même moment. Recouper les informations recueillies par différents joueurs entraîne la créations de nouvelles hypothèses qui devront être expérimentées.</w:t>
       </w:r>
     </w:p>
     <w:p>
@@ -147,13 +147,7 @@
     </w:p>
     <w:p>
       <w:r>
-        <w:t>Tant qu’il y a journalisation et possibilité de tester des hypothèses, l’élément à observer et comprendre peut grandement varier. Il peut aussi y en avoir plusieurs par jeu. Quelques exemples sont : la langue, les mœurs, les religions, l’histoire, la politique, l’économie, la nutrition, la cuisine, la médecine</w:t>
-      </w:r>
-      <w:r>
-        <w:t>, la technologie</w:t>
-      </w:r>
-      <w:r>
-        <w:t>, etc.</w:t>
+        <w:t>Tant qu’il y a journalisation et possibilité de tester des hypothèses, l’élément à observer et comprendre peut grandement varier. Il peut aussi y en avoir plusieurs par jeu. Quelques exemples sont : la langue, les mœurs, les religions, l’histoire, la politique, l’économie, la nutrition, la cuisine, la médecine, la technologie, etc.</w:t>
       </w:r>
     </w:p>
     <w:p>
@@ -167,31 +161,7 @@
     </w:p>
     <w:p>
       <w:r>
-        <w:t xml:space="preserve">Bien que le genre </w:t>
-      </w:r>
-      <w:r>
-        <w:t>ait</w:t>
-      </w:r>
-      <w:r>
-        <w:t xml:space="preserve"> été conçu initialement pour l’observation d</w:t>
-      </w:r>
-      <w:r>
-        <w:t>’une</w:t>
-      </w:r>
-      <w:r>
-        <w:t xml:space="preserve"> civilisation intelligente extraterrestre, le thème peut varier et consister en l’observation d</w:t>
-      </w:r>
-      <w:r>
-        <w:t>’une</w:t>
-      </w:r>
-      <w:r>
-        <w:t xml:space="preserve"> civilisation de fantasy, terrestre primitive, terrestre fictive ou même d’</w:t>
-      </w:r>
-      <w:r>
-        <w:t xml:space="preserve">une </w:t>
-      </w:r>
-      <w:r>
-        <w:t>espèce animale non intelligente, fictive ou non.</w:t>
+        <w:t>Bien que le genre ait été conçu initialement pour l’observation d’une civilisation intelligente extraterrestre, le thème peut varier et consister en l’observation d’une civilisation de fantasy, terrestre primitive, terrestre fictive ou même d’une espèce animale non intelligente, fictive ou non.</w:t>
       </w:r>
     </w:p>
     <w:p>
@@ -204,28 +174,7 @@
     </w:p>
     <w:p>
       <w:r>
-        <w:t xml:space="preserve">L’essentiel est que les joueurs </w:t>
-      </w:r>
-      <w:r>
-        <w:t>n’aient</w:t>
-      </w:r>
-      <w:r>
-        <w:t xml:space="preserve"> pas un point de vue omniscient et/ou une trop grande vitesse de déplacement pour que la coopération soit nécessaire entre l’expérimentation et les conséquences observables. Ainsi, il est possible de prendre tous les points de vue (2D, 3D, </w:t>
-      </w:r>
-      <w:r>
-        <w:t>p</w:t>
-      </w:r>
-      <w:r>
-        <w:t xml:space="preserve">remière personne, troisième personne, vue du dessus, vue de trois quart, vue de côté, </w:t>
-      </w:r>
-      <w:r>
-        <w:t>etc.</w:t>
-      </w:r>
-      <w:r>
-        <w:t>)</w:t>
-      </w:r>
-      <w:r>
-        <w:t>.</w:t>
+        <w:t>L’essentiel est que les joueurs n’aient pas un point de vue omniscient et/ou une trop grande vitesse de déplacement pour que la coopération soit nécessaire entre l’expérimentation et les conséquences observables. Ainsi, il est possible de prendre tous les points de vue (2D, 3D, première personne, troisième personne, vue du dessus, vue de trois quart, vue de côté, etc.).</w:t>
       </w:r>
     </w:p>
     <w:p>
@@ -250,19 +199,7 @@
     </w:p>
     <w:p>
       <w:r>
-        <w:t>Le jeu est forcément multijoueur</w:t>
-      </w:r>
-      <w:r>
-        <w:t>s</w:t>
-      </w:r>
-      <w:r>
-        <w:t xml:space="preserve"> et coopératif. Cela est absolument incompatible avec un jeu avec un point de vue omniscient car il serait alors possible de finir le jeu en solo en allant observer </w:t>
-      </w:r>
-      <w:r>
-        <w:t>soi-même</w:t>
-      </w:r>
-      <w:r>
-        <w:t xml:space="preserve"> les conséquences de ses expérimentations.</w:t>
+        <w:t>Le jeu est forcément multijoueurs et coopératif. Cela est absolument incompatible avec un jeu avec un point de vue omniscient car il serait alors possible de finir le jeu en solo en allant observer soi-même les conséquences de ses expérimentations.</w:t>
       </w:r>
     </w:p>
     <w:p>
@@ -288,13 +225,7 @@
     </w:p>
     <w:p>
       <w:r>
-        <w:t xml:space="preserve">Il serait théoriquement possible d’ajouter du gameplay pour l’exploration ou le combat mais cela n’est pas le but du jeu et ne peut pas être couplé avec une notion de progression de personnage ce qui en réduit considérablement l’intérêt. Pour cette raison, les seules actions </w:t>
-      </w:r>
-      <w:r>
-        <w:t xml:space="preserve">qu’il est </w:t>
-      </w:r>
-      <w:r>
-        <w:t>possible d’effectuer avec le personnage du joueur doivent être l’interaction et la journalisation.</w:t>
+        <w:t>Il serait théoriquement possible d’ajouter du gameplay pour l’exploration ou le combat mais cela n’est pas le but du jeu et ne peut pas être couplé avec une notion de progression de personnage ce qui en réduit considérablement l’intérêt. Pour cette raison, les seules actions qu’il est possible d’effectuer avec le personnage du joueur doivent être l’interaction et la journalisation.</w:t>
       </w:r>
     </w:p>
     <w:p>
@@ -311,17 +242,41 @@
     </w:p>
     <w:p>
       <w:r>
-        <w:t>Si en playtest on n’observe pas d’interaction entre un joueur et la civilisation, ce n’est pas un jeu du genre.</w:t>
-      </w:r>
-    </w:p>
-    <w:p>
-      <w:r>
-        <w:t>Si en playtest on n’observe pas d’interaction entre au moins deux joueurs qui leur permet de vérifier une hypothèse, ce n’est pas un jeu du genre.</w:t>
-      </w:r>
-    </w:p>
-    <w:p>
-      <w:r>
-        <w:t>Si en playtest on n’observe pas de partage des informations collectées sur la civilisation entre les joueurs, ce n’est pas un jeu du genre.</w:t>
+        <w:t xml:space="preserve">Si en </w:t>
+      </w:r>
+      <w:proofErr w:type="spellStart"/>
+      <w:r>
+        <w:t>playtest</w:t>
+      </w:r>
+      <w:proofErr w:type="spellEnd"/>
+      <w:r>
+        <w:t xml:space="preserve"> on n’observe pas d’interaction entre un joueur et la civilisation, ce n’est pas un jeu du genre.</w:t>
+      </w:r>
+    </w:p>
+    <w:p>
+      <w:r>
+        <w:t xml:space="preserve">Si en </w:t>
+      </w:r>
+      <w:proofErr w:type="spellStart"/>
+      <w:r>
+        <w:t>playtest</w:t>
+      </w:r>
+      <w:proofErr w:type="spellEnd"/>
+      <w:r>
+        <w:t xml:space="preserve"> on n’observe pas d’interaction entre au moins deux joueurs qui leur permet de vérifier une hypothèse, ce n’est pas un jeu du genre.</w:t>
+      </w:r>
+    </w:p>
+    <w:p>
+      <w:r>
+        <w:t xml:space="preserve">Si en </w:t>
+      </w:r>
+      <w:proofErr w:type="spellStart"/>
+      <w:r>
+        <w:t>playtest</w:t>
+      </w:r>
+      <w:proofErr w:type="spellEnd"/>
+      <w:r>
+        <w:t xml:space="preserve"> on n’observe pas de partage des informations collectées sur la civilisation entre les joueurs, ce n’est pas un jeu du genre.</w:t>
       </w:r>
     </w:p>
     <w:p>
@@ -340,6 +295,7 @@
       <w:pPr>
         <w:pStyle w:val="Titre2"/>
       </w:pPr>
+      <w:proofErr w:type="spellStart"/>
       <w:r>
         <w:rPr>
           <w:i/>
@@ -347,8 +303,17 @@
         </w:rPr>
         <w:t>Populous</w:t>
       </w:r>
-      <w:r>
-        <w:t xml:space="preserve"> (Bullfrog, 1989)</w:t>
+      <w:proofErr w:type="spellEnd"/>
+      <w:r>
+        <w:t xml:space="preserve"> (</w:t>
+      </w:r>
+      <w:proofErr w:type="spellStart"/>
+      <w:r>
+        <w:t>Bullfrog</w:t>
+      </w:r>
+      <w:proofErr w:type="spellEnd"/>
+      <w:r>
+        <w:t>, 1989)</w:t>
       </w:r>
     </w:p>
     <w:p>
@@ -363,9 +328,12 @@
       </w:r>
     </w:p>
     <w:p>
+      <w:pPr>
+        <w:pStyle w:val="Titre3"/>
+      </w:pPr>
       <w:r>
         <w:lastRenderedPageBreak/>
-        <w:t>Ressemblances :</w:t>
+        <w:t>Ressemblances</w:t>
       </w:r>
     </w:p>
     <w:p>
@@ -393,8 +361,11 @@
       </w:r>
     </w:p>
     <w:p>
-      <w:r>
-        <w:t>Différences :</w:t>
+      <w:pPr>
+        <w:pStyle w:val="Titre3"/>
+      </w:pPr>
+      <w:r>
+        <w:t>Différences</w:t>
       </w:r>
     </w:p>
     <w:p>
@@ -408,6 +379,7 @@
       <w:r>
         <w:t xml:space="preserve">Quand bien même </w:t>
       </w:r>
+      <w:proofErr w:type="spellStart"/>
       <w:r>
         <w:rPr>
           <w:i/>
@@ -415,6 +387,7 @@
         </w:rPr>
         <w:t>Populous</w:t>
       </w:r>
+      <w:proofErr w:type="spellEnd"/>
       <w:r>
         <w:t xml:space="preserve"> comporte un mode deux joueurs, il s’agit d’un versus où le deuxième joueur incarne la civilisation adverse. Notre jeu est nécessairement en coop, avec au moins deux joueurs.</w:t>
       </w:r>
@@ -442,6 +415,7 @@
       <w:r>
         <w:t xml:space="preserve">En lien avec le point précédent, l’aspect puzzle lié à l’observation et l’expression d’hypothèses est absent de </w:t>
       </w:r>
+      <w:proofErr w:type="spellStart"/>
       <w:r>
         <w:rPr>
           <w:i/>
@@ -449,6 +423,7 @@
         </w:rPr>
         <w:t>Populous</w:t>
       </w:r>
+      <w:proofErr w:type="spellEnd"/>
       <w:r>
         <w:t>.</w:t>
       </w:r>
@@ -462,10 +437,27 @@
           <w:i/>
           <w:iCs/>
         </w:rPr>
-        <w:t>Chants of Sennaar</w:t>
-      </w:r>
-      <w:r>
-        <w:t xml:space="preserve"> (Rundisc, 2023)</w:t>
+        <w:t xml:space="preserve">Chants of </w:t>
+      </w:r>
+      <w:proofErr w:type="spellStart"/>
+      <w:r>
+        <w:rPr>
+          <w:i/>
+          <w:iCs/>
+        </w:rPr>
+        <w:t>Sennaar</w:t>
+      </w:r>
+      <w:proofErr w:type="spellEnd"/>
+      <w:r>
+        <w:t xml:space="preserve"> (</w:t>
+      </w:r>
+      <w:proofErr w:type="spellStart"/>
+      <w:r>
+        <w:t>Rundisc</w:t>
+      </w:r>
+      <w:proofErr w:type="spellEnd"/>
+      <w:r>
+        <w:t>, 2023)</w:t>
       </w:r>
     </w:p>
     <w:p>
@@ -474,8 +466,11 @@
       </w:r>
     </w:p>
     <w:p>
-      <w:r>
-        <w:t>Ressemblances :</w:t>
+      <w:pPr>
+        <w:pStyle w:val="Titre3"/>
+      </w:pPr>
+      <w:r>
+        <w:t>Ressemblances</w:t>
       </w:r>
     </w:p>
     <w:p>
@@ -503,8 +498,11 @@
       </w:r>
     </w:p>
     <w:p>
-      <w:r>
-        <w:t>Différences :</w:t>
+      <w:pPr>
+        <w:pStyle w:val="Titre3"/>
+      </w:pPr>
+      <w:r>
+        <w:t>Différences</w:t>
       </w:r>
     </w:p>
     <w:p>
@@ -528,15 +526,32 @@
         </w:numPr>
       </w:pPr>
       <w:r>
-        <w:t xml:space="preserve">Malgré quelques ouvertures dans le level design qui permettent de ne pas être bloqué sur un seul puzzle à la fois, </w:t>
+        <w:t xml:space="preserve">Malgré quelques ouvertures dans le </w:t>
+      </w:r>
+      <w:proofErr w:type="spellStart"/>
+      <w:r>
+        <w:t>level</w:t>
+      </w:r>
+      <w:proofErr w:type="spellEnd"/>
+      <w:r>
+        <w:t xml:space="preserve"> design qui permettent de ne pas être bloqué sur un seul puzzle à la fois, </w:t>
       </w:r>
       <w:r>
         <w:rPr>
           <w:i/>
           <w:iCs/>
         </w:rPr>
-        <w:t>Chants of Sennaar</w:t>
-      </w:r>
+        <w:t xml:space="preserve">Chants of </w:t>
+      </w:r>
+      <w:proofErr w:type="spellStart"/>
+      <w:r>
+        <w:rPr>
+          <w:i/>
+          <w:iCs/>
+        </w:rPr>
+        <w:t>Sennaar</w:t>
+      </w:r>
+      <w:proofErr w:type="spellEnd"/>
       <w:r>
         <w:t xml:space="preserve"> est un jeu principalement linéaire. Dans notre jeu, la civilisation est libre d’être observée sous n’importe quel angle et dans n’importe quel ordre. En ce sens, le déroulé de chaque partie est forcément différent des autres, en fonction des multiples choix des joueurs.</w:t>
       </w:r>
@@ -554,8 +569,17 @@
           <w:i/>
           <w:iCs/>
         </w:rPr>
-        <w:t>Chants of Sennaar</w:t>
-      </w:r>
+        <w:t xml:space="preserve">Chants of </w:t>
+      </w:r>
+      <w:proofErr w:type="spellStart"/>
+      <w:r>
+        <w:rPr>
+          <w:i/>
+          <w:iCs/>
+        </w:rPr>
+        <w:t>Sennaar</w:t>
+      </w:r>
+      <w:proofErr w:type="spellEnd"/>
       <w:r>
         <w:t xml:space="preserve"> est un jeu solo et non pas multijoueurs.</w:t>
       </w:r>
@@ -573,8 +597,17 @@
           <w:i/>
           <w:iCs/>
         </w:rPr>
-        <w:t>Chants of Sennaar</w:t>
-      </w:r>
+        <w:t xml:space="preserve">Chants of </w:t>
+      </w:r>
+      <w:proofErr w:type="spellStart"/>
+      <w:r>
+        <w:rPr>
+          <w:i/>
+          <w:iCs/>
+        </w:rPr>
+        <w:t>Sennaar</w:t>
+      </w:r>
+      <w:proofErr w:type="spellEnd"/>
       <w:r>
         <w:t xml:space="preserve"> n’est pas en temps réel.</w:t>
       </w:r>
@@ -595,8 +628,17 @@
           <w:i/>
           <w:iCs/>
         </w:rPr>
-        <w:t>Chants of Sennaar</w:t>
-      </w:r>
+        <w:t xml:space="preserve">Chants of </w:t>
+      </w:r>
+      <w:proofErr w:type="spellStart"/>
+      <w:r>
+        <w:rPr>
+          <w:i/>
+          <w:iCs/>
+        </w:rPr>
+        <w:t>Sennaar</w:t>
+      </w:r>
+      <w:proofErr w:type="spellEnd"/>
       <w:r>
         <w:t>, le joueur ne fait qu’observer la civilisation, dans notre jeu, une interaction avec elle est nécessaire pour tester ses hypothèses. Cette interaction peut donc avoir un impact sur son développement.</w:t>
       </w:r>
@@ -613,7 +655,15 @@
         <w:t>Big Walk</w:t>
       </w:r>
       <w:r>
-        <w:t xml:space="preserve"> (House House, 2026)</w:t>
+        <w:t xml:space="preserve"> (House </w:t>
+      </w:r>
+      <w:proofErr w:type="spellStart"/>
+      <w:r>
+        <w:t>House</w:t>
+      </w:r>
+      <w:proofErr w:type="spellEnd"/>
+      <w:r>
+        <w:t>, 2026)</w:t>
       </w:r>
     </w:p>
     <w:p>
@@ -622,9 +672,12 @@
       </w:r>
     </w:p>
     <w:p>
+      <w:pPr>
+        <w:pStyle w:val="Titre3"/>
+      </w:pPr>
       <w:r>
         <w:lastRenderedPageBreak/>
-        <w:t>Ressemblances :</w:t>
+        <w:t>Ressemblances</w:t>
       </w:r>
     </w:p>
     <w:p>
@@ -664,8 +717,11 @@
       </w:r>
     </w:p>
     <w:p>
-      <w:r>
-        <w:t>Différences :</w:t>
+      <w:pPr>
+        <w:pStyle w:val="Titre3"/>
+      </w:pPr>
+      <w:r>
+        <w:t>Différences</w:t>
       </w:r>
     </w:p>
     <w:p>
@@ -714,9 +770,13 @@
     </w:p>
     <w:p/>
     <w:sectPr>
+      <w:footerReference w:type="default" r:id="rId9"/>
+      <w:headerReference w:type="first" r:id="rId10"/>
+      <w:footerReference w:type="first" r:id="rId11"/>
       <w:pgSz w:w="11906" w:h="16838"/>
       <w:pgMar w:top="1417" w:right="1417" w:bottom="1417" w:left="1417" w:header="708" w:footer="708" w:gutter="0"/>
       <w:cols w:space="708"/>
+      <w:titlePg/>
       <w:docGrid w:linePitch="360"/>
     </w:sectPr>
   </w:body>
@@ -748,6 +808,90 @@
 </w:endnotes>
 </file>
 
+<file path=word/footer1.xml><?xml version="1.0" encoding="utf-8"?>
+<w:ftr xmlns:wpc="http://schemas.microsoft.com/office/word/2010/wordprocessingCanvas" xmlns:cx="http://schemas.microsoft.com/office/drawing/2014/chartex" xmlns:cx1="http://schemas.microsoft.com/office/drawing/2015/9/8/chartex" xmlns:cx2="http://schemas.microsoft.com/office/drawing/2015/10/21/chartex" xmlns:cx3="http://schemas.microsoft.com/office/drawing/2016/5/9/chartex" xmlns:cx4="http://schemas.microsoft.com/office/drawing/2016/5/10/chartex" xmlns:cx5="http://schemas.microsoft.com/office/drawing/2016/5/11/chartex" xmlns:cx6="http://schemas.microsoft.com/office/drawing/2016/5/12/chartex" xmlns:cx7="http://schemas.microsoft.com/office/drawing/2016/5/13/chartex" xmlns:cx8="http://schemas.microsoft.com/office/drawing/2016/5/14/chartex" xmlns:mc="http://schemas.openxmlformats.org/markup-compatibility/2006" xmlns:aink="http://schemas.microsoft.com/office/drawing/2016/ink" xmlns:am3d="http://schemas.microsoft.com/office/drawing/2017/model3d" xmlns:o="urn:schemas-microsoft-com:office:office" xmlns:oel="http://schemas.microsoft.com/office/2019/extlst" xmlns:r="http://schemas.openxmlformats.org/officeDocument/2006/relationships" xmlns:m="http://schemas.openxmlformats.org/officeDocument/2006/math" xmlns:v="urn:schemas-microsoft-com:vml" xmlns:wp14="http://schemas.microsoft.com/office/word/2010/wordprocessingDrawing" xmlns:wp="http://schemas.openxmlformats.org/drawingml/2006/wordprocessingDrawing" xmlns:w10="urn:schemas-microsoft-com:office:word" xmlns:w="http://schemas.openxmlformats.org/wordprocessingml/2006/main" xmlns:w14="http://schemas.microsoft.com/office/word/2010/wordml" xmlns:w15="http://schemas.microsoft.com/office/word/2012/wordml" xmlns:w16cex="http://schemas.microsoft.com/office/word/2018/wordml/cex" xmlns:w16cid="http://schemas.microsoft.com/office/word/2016/wordml/cid" xmlns:w16="http://schemas.microsoft.com/office/word/2018/wordml" xmlns:w16du="http://schemas.microsoft.com/office/word/2023/wordml/word16du" xmlns:w16sdtdh="http://schemas.microsoft.com/office/word/2020/wordml/sdtdatahash" xmlns:w16sdtfl="http://schemas.microsoft.com/office/word/2024/wordml/sdtformatlock" xmlns:w16se="http://schemas.microsoft.com/office/word/2015/wordml/symex" xmlns:wpg="http://schemas.microsoft.com/office/word/2010/wordprocessingGroup" xmlns:wpi="http://schemas.microsoft.com/office/word/2010/wordprocessingInk" xmlns:wne="http://schemas.microsoft.com/office/word/2006/wordml" xmlns:wps="http://schemas.microsoft.com/office/word/2010/wordprocessingShape" mc:Ignorable="w14 w15 w16se w16cid w16 w16cex w16sdtdh w16sdtfl w16du wp14">
+  <w:sdt>
+    <w:sdtPr>
+      <w:id w:val="-1970195677"/>
+      <w:docPartObj>
+        <w:docPartGallery w:val="Page Numbers (Bottom of Page)"/>
+        <w:docPartUnique/>
+      </w:docPartObj>
+    </w:sdtPr>
+    <w:sdtContent>
+      <w:p>
+        <w:pPr>
+          <w:pStyle w:val="Pieddepage"/>
+          <w:jc w:val="center"/>
+        </w:pPr>
+        <w:r>
+          <w:fldChar w:fldCharType="begin"/>
+        </w:r>
+        <w:r>
+          <w:instrText>PAGE   \* MERGEFORMAT</w:instrText>
+        </w:r>
+        <w:r>
+          <w:fldChar w:fldCharType="separate"/>
+        </w:r>
+        <w:r>
+          <w:t>2</w:t>
+        </w:r>
+        <w:r>
+          <w:fldChar w:fldCharType="end"/>
+        </w:r>
+      </w:p>
+    </w:sdtContent>
+  </w:sdt>
+  <w:p>
+    <w:pPr>
+      <w:pStyle w:val="Pieddepage"/>
+    </w:pPr>
+  </w:p>
+</w:ftr>
+</file>
+
+<file path=word/footer2.xml><?xml version="1.0" encoding="utf-8"?>
+<w:ftr xmlns:wpc="http://schemas.microsoft.com/office/word/2010/wordprocessingCanvas" xmlns:cx="http://schemas.microsoft.com/office/drawing/2014/chartex" xmlns:cx1="http://schemas.microsoft.com/office/drawing/2015/9/8/chartex" xmlns:cx2="http://schemas.microsoft.com/office/drawing/2015/10/21/chartex" xmlns:cx3="http://schemas.microsoft.com/office/drawing/2016/5/9/chartex" xmlns:cx4="http://schemas.microsoft.com/office/drawing/2016/5/10/chartex" xmlns:cx5="http://schemas.microsoft.com/office/drawing/2016/5/11/chartex" xmlns:cx6="http://schemas.microsoft.com/office/drawing/2016/5/12/chartex" xmlns:cx7="http://schemas.microsoft.com/office/drawing/2016/5/13/chartex" xmlns:cx8="http://schemas.microsoft.com/office/drawing/2016/5/14/chartex" xmlns:mc="http://schemas.openxmlformats.org/markup-compatibility/2006" xmlns:aink="http://schemas.microsoft.com/office/drawing/2016/ink" xmlns:am3d="http://schemas.microsoft.com/office/drawing/2017/model3d" xmlns:o="urn:schemas-microsoft-com:office:office" xmlns:oel="http://schemas.microsoft.com/office/2019/extlst" xmlns:r="http://schemas.openxmlformats.org/officeDocument/2006/relationships" xmlns:m="http://schemas.openxmlformats.org/officeDocument/2006/math" xmlns:v="urn:schemas-microsoft-com:vml" xmlns:wp14="http://schemas.microsoft.com/office/word/2010/wordprocessingDrawing" xmlns:wp="http://schemas.openxmlformats.org/drawingml/2006/wordprocessingDrawing" xmlns:w10="urn:schemas-microsoft-com:office:word" xmlns:w="http://schemas.openxmlformats.org/wordprocessingml/2006/main" xmlns:w14="http://schemas.microsoft.com/office/word/2010/wordml" xmlns:w15="http://schemas.microsoft.com/office/word/2012/wordml" xmlns:w16cex="http://schemas.microsoft.com/office/word/2018/wordml/cex" xmlns:w16cid="http://schemas.microsoft.com/office/word/2016/wordml/cid" xmlns:w16="http://schemas.microsoft.com/office/word/2018/wordml" xmlns:w16du="http://schemas.microsoft.com/office/word/2023/wordml/word16du" xmlns:w16sdtdh="http://schemas.microsoft.com/office/word/2020/wordml/sdtdatahash" xmlns:w16sdtfl="http://schemas.microsoft.com/office/word/2024/wordml/sdtformatlock" xmlns:w16se="http://schemas.microsoft.com/office/word/2015/wordml/symex" xmlns:wpg="http://schemas.microsoft.com/office/word/2010/wordprocessingGroup" xmlns:wpi="http://schemas.microsoft.com/office/word/2010/wordprocessingInk" xmlns:wne="http://schemas.microsoft.com/office/word/2006/wordml" xmlns:wps="http://schemas.microsoft.com/office/word/2010/wordprocessingShape" mc:Ignorable="w14 w15 w16se w16cid w16 w16cex w16sdtdh w16sdtfl w16du wp14">
+  <w:sdt>
+    <w:sdtPr>
+      <w:id w:val="-269860885"/>
+      <w:docPartObj>
+        <w:docPartGallery w:val="Page Numbers (Bottom of Page)"/>
+        <w:docPartUnique/>
+      </w:docPartObj>
+    </w:sdtPr>
+    <w:sdtContent>
+      <w:p>
+        <w:pPr>
+          <w:pStyle w:val="Pieddepage"/>
+          <w:jc w:val="center"/>
+        </w:pPr>
+        <w:r>
+          <w:fldChar w:fldCharType="begin"/>
+        </w:r>
+        <w:r>
+          <w:instrText>PAGE   \* MERGEFORMAT</w:instrText>
+        </w:r>
+        <w:r>
+          <w:fldChar w:fldCharType="separate"/>
+        </w:r>
+        <w:r>
+          <w:t>2</w:t>
+        </w:r>
+        <w:r>
+          <w:fldChar w:fldCharType="end"/>
+        </w:r>
+      </w:p>
+    </w:sdtContent>
+  </w:sdt>
+  <w:p>
+    <w:pPr>
+      <w:pStyle w:val="Pieddepage"/>
+    </w:pPr>
+  </w:p>
+</w:ftr>
+</file>
+
 <file path=word/footnotes.xml><?xml version="1.0" encoding="utf-8"?>
 <w:footnotes xmlns:wpc="http://schemas.microsoft.com/office/word/2010/wordprocessingCanvas" xmlns:cx="http://schemas.microsoft.com/office/drawing/2014/chartex" xmlns:cx1="http://schemas.microsoft.com/office/drawing/2015/9/8/chartex" xmlns:cx2="http://schemas.microsoft.com/office/drawing/2015/10/21/chartex" xmlns:cx3="http://schemas.microsoft.com/office/drawing/2016/5/9/chartex" xmlns:cx4="http://schemas.microsoft.com/office/drawing/2016/5/10/chartex" xmlns:cx5="http://schemas.microsoft.com/office/drawing/2016/5/11/chartex" xmlns:cx6="http://schemas.microsoft.com/office/drawing/2016/5/12/chartex" xmlns:cx7="http://schemas.microsoft.com/office/drawing/2016/5/13/chartex" xmlns:cx8="http://schemas.microsoft.com/office/drawing/2016/5/14/chartex" xmlns:mc="http://schemas.openxmlformats.org/markup-compatibility/2006" xmlns:aink="http://schemas.microsoft.com/office/drawing/2016/ink" xmlns:am3d="http://schemas.microsoft.com/office/drawing/2017/model3d" xmlns:o="urn:schemas-microsoft-com:office:office" xmlns:oel="http://schemas.microsoft.com/office/2019/extlst" xmlns:r="http://schemas.openxmlformats.org/officeDocument/2006/relationships" xmlns:m="http://schemas.openxmlformats.org/officeDocument/2006/math" xmlns:v="urn:schemas-microsoft-com:vml" xmlns:wp14="http://schemas.microsoft.com/office/word/2010/wordprocessingDrawing" xmlns:wp="http://schemas.openxmlformats.org/drawingml/2006/wordprocessingDrawing" xmlns:w10="urn:schemas-microsoft-com:office:word" xmlns:w="http://schemas.openxmlformats.org/wordprocessingml/2006/main" xmlns:w14="http://schemas.microsoft.com/office/word/2010/wordml" xmlns:w15="http://schemas.microsoft.com/office/word/2012/wordml" xmlns:w16cex="http://schemas.microsoft.com/office/word/2018/wordml/cex" xmlns:w16cid="http://schemas.microsoft.com/office/word/2016/wordml/cid" xmlns:w16="http://schemas.microsoft.com/office/word/2018/wordml" xmlns:w16du="http://schemas.microsoft.com/office/word/2023/wordml/word16du" xmlns:w16sdtdh="http://schemas.microsoft.com/office/word/2020/wordml/sdtdatahash" xmlns:w16sdtfl="http://schemas.microsoft.com/office/word/2024/wordml/sdtformatlock" xmlns:w16se="http://schemas.microsoft.com/office/word/2015/wordml/symex" xmlns:wpg="http://schemas.microsoft.com/office/word/2010/wordprocessingGroup" xmlns:wpi="http://schemas.microsoft.com/office/word/2010/wordprocessingInk" xmlns:wne="http://schemas.microsoft.com/office/word/2006/wordml" xmlns:wps="http://schemas.microsoft.com/office/word/2010/wordprocessingShape" mc:Ignorable="w14 w15 w16se w16cid w16 w16cex w16sdtdh w16sdtfl w16du wp14">
   <w:footnote w:type="separator" w:id="-1">
@@ -771,6 +915,32 @@
     </w:p>
   </w:footnote>
 </w:footnotes>
+</file>
+
+<file path=word/header1.xml><?xml version="1.0" encoding="utf-8"?>
+<w:hdr xmlns:wpc="http://schemas.microsoft.com/office/word/2010/wordprocessingCanvas" xmlns:cx="http://schemas.microsoft.com/office/drawing/2014/chartex" xmlns:cx1="http://schemas.microsoft.com/office/drawing/2015/9/8/chartex" xmlns:cx2="http://schemas.microsoft.com/office/drawing/2015/10/21/chartex" xmlns:cx3="http://schemas.microsoft.com/office/drawing/2016/5/9/chartex" xmlns:cx4="http://schemas.microsoft.com/office/drawing/2016/5/10/chartex" xmlns:cx5="http://schemas.microsoft.com/office/drawing/2016/5/11/chartex" xmlns:cx6="http://schemas.microsoft.com/office/drawing/2016/5/12/chartex" xmlns:cx7="http://schemas.microsoft.com/office/drawing/2016/5/13/chartex" xmlns:cx8="http://schemas.microsoft.com/office/drawing/2016/5/14/chartex" xmlns:mc="http://schemas.openxmlformats.org/markup-compatibility/2006" xmlns:aink="http://schemas.microsoft.com/office/drawing/2016/ink" xmlns:am3d="http://schemas.microsoft.com/office/drawing/2017/model3d" xmlns:o="urn:schemas-microsoft-com:office:office" xmlns:oel="http://schemas.microsoft.com/office/2019/extlst" xmlns:r="http://schemas.openxmlformats.org/officeDocument/2006/relationships" xmlns:m="http://schemas.openxmlformats.org/officeDocument/2006/math" xmlns:v="urn:schemas-microsoft-com:vml" xmlns:wp14="http://schemas.microsoft.com/office/word/2010/wordprocessingDrawing" xmlns:wp="http://schemas.openxmlformats.org/drawingml/2006/wordprocessingDrawing" xmlns:w10="urn:schemas-microsoft-com:office:word" xmlns:w="http://schemas.openxmlformats.org/wordprocessingml/2006/main" xmlns:w14="http://schemas.microsoft.com/office/word/2010/wordml" xmlns:w15="http://schemas.microsoft.com/office/word/2012/wordml" xmlns:w16cex="http://schemas.microsoft.com/office/word/2018/wordml/cex" xmlns:w16cid="http://schemas.microsoft.com/office/word/2016/wordml/cid" xmlns:w16="http://schemas.microsoft.com/office/word/2018/wordml" xmlns:w16du="http://schemas.microsoft.com/office/word/2023/wordml/word16du" xmlns:w16sdtdh="http://schemas.microsoft.com/office/word/2020/wordml/sdtdatahash" xmlns:w16sdtfl="http://schemas.microsoft.com/office/word/2024/wordml/sdtformatlock" xmlns:w16se="http://schemas.microsoft.com/office/word/2015/wordml/symex" xmlns:wpg="http://schemas.microsoft.com/office/word/2010/wordprocessingGroup" xmlns:wpi="http://schemas.microsoft.com/office/word/2010/wordprocessingInk" xmlns:wne="http://schemas.microsoft.com/office/word/2006/wordml" xmlns:wps="http://schemas.microsoft.com/office/word/2010/wordprocessingShape" mc:Ignorable="w14 w15 w16se w16cid w16 w16cex w16sdtdh w16sdtfl w16du wp14">
+  <w:p>
+    <w:pPr>
+      <w:pStyle w:val="En-tte"/>
+    </w:pPr>
+    <w:r>
+      <w:t>BRIGAULT Elise, BUTTET Mathieu, RODRIGUES Anthony et Marjolène, SERRAF Jordan</w:t>
+    </w:r>
+  </w:p>
+  <w:p>
+    <w:pPr>
+      <w:pStyle w:val="En-tte"/>
+    </w:pPr>
+    <w:proofErr w:type="spellStart"/>
+    <w:r>
+      <w:t>Gamagora</w:t>
+    </w:r>
+    <w:proofErr w:type="spellEnd"/>
+    <w:r>
+      <w:t xml:space="preserve"> LP LD 2026-2027</w:t>
+    </w:r>
+  </w:p>
+</w:hdr>
 </file>
 
 <file path=word/numbering.xml><?xml version="1.0" encoding="utf-8"?>
@@ -2070,17 +2240,17 @@
     <w:link w:val="Titre1Car"/>
     <w:uiPriority w:val="9"/>
     <w:qFormat/>
-    <w:rsid w:val="008803AC"/>
+    <w:rsid w:val="006B7BC7"/>
     <w:pPr>
       <w:keepNext/>
       <w:keepLines/>
-      <w:spacing w:before="360" w:after="80"/>
+      <w:spacing w:before="120" w:after="80"/>
       <w:outlineLvl w:val="0"/>
     </w:pPr>
     <w:rPr>
       <w:rFonts w:asciiTheme="majorHAnsi" w:eastAsiaTheme="majorEastAsia" w:hAnsiTheme="majorHAnsi" w:cstheme="majorBidi"/>
       <w:color w:val="0F4761" w:themeColor="accent1" w:themeShade="BF"/>
-      <w:sz w:val="40"/>
+      <w:sz w:val="44"/>
       <w:szCs w:val="40"/>
     </w:rPr>
   </w:style>
@@ -2092,11 +2262,11 @@
     <w:uiPriority w:val="9"/>
     <w:unhideWhenUsed/>
     <w:qFormat/>
-    <w:rsid w:val="008803AC"/>
+    <w:rsid w:val="006B7BC7"/>
     <w:pPr>
       <w:keepNext/>
       <w:keepLines/>
-      <w:spacing w:before="160" w:after="80"/>
+      <w:spacing w:before="80" w:after="80"/>
       <w:outlineLvl w:val="1"/>
     </w:pPr>
     <w:rPr>
@@ -2114,17 +2284,17 @@
     <w:uiPriority w:val="9"/>
     <w:unhideWhenUsed/>
     <w:qFormat/>
-    <w:rsid w:val="008803AC"/>
+    <w:rsid w:val="006B7BC7"/>
     <w:pPr>
       <w:keepNext/>
       <w:keepLines/>
-      <w:spacing w:before="160" w:after="80"/>
+      <w:spacing w:before="80" w:after="80"/>
       <w:outlineLvl w:val="2"/>
     </w:pPr>
     <w:rPr>
       <w:rFonts w:eastAsiaTheme="majorEastAsia" w:cstheme="majorBidi"/>
       <w:color w:val="0F4761" w:themeColor="accent1" w:themeShade="BF"/>
-      <w:sz w:val="28"/>
+      <w:sz w:val="24"/>
       <w:szCs w:val="28"/>
     </w:rPr>
   </w:style>
@@ -2292,11 +2462,11 @@
     <w:basedOn w:val="Policepardfaut"/>
     <w:link w:val="Titre1"/>
     <w:uiPriority w:val="9"/>
-    <w:rsid w:val="008803AC"/>
+    <w:rsid w:val="006B7BC7"/>
     <w:rPr>
       <w:rFonts w:asciiTheme="majorHAnsi" w:eastAsiaTheme="majorEastAsia" w:hAnsiTheme="majorHAnsi" w:cstheme="majorBidi"/>
       <w:color w:val="0F4761" w:themeColor="accent1" w:themeShade="BF"/>
-      <w:sz w:val="40"/>
+      <w:sz w:val="44"/>
       <w:szCs w:val="40"/>
     </w:rPr>
   </w:style>
@@ -2305,7 +2475,7 @@
     <w:basedOn w:val="Policepardfaut"/>
     <w:link w:val="Titre2"/>
     <w:uiPriority w:val="9"/>
-    <w:rsid w:val="008803AC"/>
+    <w:rsid w:val="006B7BC7"/>
     <w:rPr>
       <w:rFonts w:asciiTheme="majorHAnsi" w:eastAsiaTheme="majorEastAsia" w:hAnsiTheme="majorHAnsi" w:cstheme="majorBidi"/>
       <w:color w:val="0F4761" w:themeColor="accent1" w:themeShade="BF"/>
@@ -2318,11 +2488,11 @@
     <w:basedOn w:val="Policepardfaut"/>
     <w:link w:val="Titre3"/>
     <w:uiPriority w:val="9"/>
-    <w:rsid w:val="008803AC"/>
+    <w:rsid w:val="006B7BC7"/>
     <w:rPr>
       <w:rFonts w:eastAsiaTheme="majorEastAsia" w:cstheme="majorBidi"/>
       <w:color w:val="0F4761" w:themeColor="accent1" w:themeShade="BF"/>
-      <w:sz w:val="28"/>
+      <w:sz w:val="24"/>
       <w:szCs w:val="28"/>
     </w:rPr>
   </w:style>
@@ -2411,7 +2581,7 @@
     <w:link w:val="TitreCar"/>
     <w:uiPriority w:val="10"/>
     <w:qFormat/>
-    <w:rsid w:val="008803AC"/>
+    <w:rsid w:val="006B7BC7"/>
     <w:pPr>
       <w:spacing w:after="80" w:line="240" w:lineRule="auto"/>
       <w:contextualSpacing/>
@@ -2429,7 +2599,7 @@
     <w:basedOn w:val="Policepardfaut"/>
     <w:link w:val="Titre"/>
     <w:uiPriority w:val="10"/>
-    <w:rsid w:val="008803AC"/>
+    <w:rsid w:val="006B7BC7"/>
     <w:rPr>
       <w:rFonts w:asciiTheme="majorHAnsi" w:eastAsiaTheme="majorEastAsia" w:hAnsiTheme="majorHAnsi" w:cstheme="majorBidi"/>
       <w:spacing w:val="-10"/>
@@ -2624,6 +2794,50 @@
       <w:color w:val="467886" w:themeColor="hyperlink"/>
       <w:u w:val="single"/>
     </w:rPr>
+  </w:style>
+  <w:style w:type="paragraph" w:styleId="En-tte">
+    <w:name w:val="header"/>
+    <w:basedOn w:val="Normal"/>
+    <w:link w:val="En-tteCar"/>
+    <w:uiPriority w:val="99"/>
+    <w:unhideWhenUsed/>
+    <w:rsid w:val="006B7BC7"/>
+    <w:pPr>
+      <w:tabs>
+        <w:tab w:val="center" w:pos="4536"/>
+        <w:tab w:val="right" w:pos="9072"/>
+      </w:tabs>
+      <w:spacing w:after="0" w:line="240" w:lineRule="auto"/>
+    </w:pPr>
+  </w:style>
+  <w:style w:type="character" w:customStyle="1" w:styleId="En-tteCar">
+    <w:name w:val="En-tête Car"/>
+    <w:basedOn w:val="Policepardfaut"/>
+    <w:link w:val="En-tte"/>
+    <w:uiPriority w:val="99"/>
+    <w:rsid w:val="006B7BC7"/>
+  </w:style>
+  <w:style w:type="paragraph" w:styleId="Pieddepage">
+    <w:name w:val="footer"/>
+    <w:basedOn w:val="Normal"/>
+    <w:link w:val="PieddepageCar"/>
+    <w:uiPriority w:val="99"/>
+    <w:unhideWhenUsed/>
+    <w:rsid w:val="006B7BC7"/>
+    <w:pPr>
+      <w:tabs>
+        <w:tab w:val="center" w:pos="4536"/>
+        <w:tab w:val="right" w:pos="9072"/>
+      </w:tabs>
+      <w:spacing w:after="0" w:line="240" w:lineRule="auto"/>
+    </w:pPr>
+  </w:style>
+  <w:style w:type="character" w:customStyle="1" w:styleId="PieddepageCar">
+    <w:name w:val="Pied de page Car"/>
+    <w:basedOn w:val="Policepardfaut"/>
+    <w:link w:val="Pieddepage"/>
+    <w:uiPriority w:val="99"/>
+    <w:rsid w:val="006B7BC7"/>
   </w:style>
 </w:styles>
 </file>

</xml_diff>